<commit_message>
Adiciona curso de Python (Udemy) ao currículo
</commit_message>
<xml_diff>
--- a/assets/cv/arthur-lincoln-curriculo.docx
+++ b/assets/cv/arthur-lincoln-curriculo.docx
@@ -386,6 +386,20 @@
     <w:p>
       <w:pPr>
         <w:pStyle w:val="BodyText"/>
+        <w:spacing w:before="3"/>
+        <w:ind w:right="38"/>
+        <w:jc w:val="right"/>
+      </w:pPr>
+      <w:r>
+        <w:rPr>
+          <w:color w:val="FFFFFF"/>
+        </w:rPr>
+        <w:t>Juazeiro, BA</w:t>
+      </w:r>
+    </w:p>
+    <w:p>
+      <w:pPr>
+        <w:pStyle w:val="BodyText"/>
         <w:spacing w:before="171"/>
       </w:pPr>
     </w:p>
@@ -743,6 +757,64 @@
           <w:color w:val="FFFFFF"/>
         </w:rPr>
         <w:t>Português</w:t>
+      </w:r>
+    </w:p>
+    <w:p>
+      <w:pPr>
+        <w:pStyle w:val="BodyText"/>
+        <w:spacing w:before="56"/>
+      </w:pPr>
+    </w:p>
+    <w:p>
+      <w:pPr>
+        <w:pStyle w:val="Heading1"/>
+        <w:ind w:right="38"/>
+        <w:jc w:val="right"/>
+        <w:rPr>
+          <w:u w:val="none"/>
+        </w:rPr>
+      </w:pPr>
+      <w:r>
+        <w:rPr>
+          <w:color w:val="FFFFFF"/>
+          <w:spacing w:val="-6"/>
+          <w:u w:val="thick" w:color="FFFFFF"/>
+        </w:rPr>
+        <w:t>CURSOS</w:t>
+      </w:r>
+    </w:p>
+    <w:p>
+      <w:pPr>
+        <w:pStyle w:val="BodyText"/>
+        <w:spacing w:before="191"/>
+        <w:ind w:right="38"/>
+        <w:jc w:val="right"/>
+      </w:pPr>
+      <w:r>
+        <w:rPr>
+          <w:color w:val="FFFFFF"/>
+          <w:w w:val="90"/>
+        </w:rPr>
+        <w:t>UDEMY, 2026</w:t>
+      </w:r>
+    </w:p>
+    <w:p>
+      <w:pPr>
+        <w:pStyle w:val="Heading3"/>
+        <w:spacing w:before="3" w:line="242" w:lineRule="auto"/>
+        <w:ind w:left="941" w:right="38" w:hanging="757"/>
+        <w:jc w:val="right"/>
+        <w:rPr>
+          <w:color w:val="FFFFFF"/>
+          <w:spacing w:val="-2"/>
+          <w:w w:val="90"/>
+        </w:rPr>
+      </w:pPr>
+      <w:r>
+        <w:rPr>
+          <w:color w:val="FFFFFF"/>
+        </w:rPr>
+        <w:t>Python 3 do básico ao avançado, 141,5 h</w:t>
       </w:r>
     </w:p>
     <w:p>
@@ -984,7 +1056,7 @@
           <w:w w:val="90"/>
           <w:sz w:val="24"/>
         </w:rPr>
-        <w:t xml:space="preserve">Eixo 0 (versão barebones) | </w:t>
+        <w:t xml:space="preserve">Eixo 0 | </w:t>
       </w:r>
       <w:r>
         <w:rPr>
@@ -992,7 +1064,7 @@
           <w:b/>
           <w:w w:val="90"/>
         </w:rPr>
-        <w:t>Projeto pessoal | Java 17 e Maven</w:t>
+        <w:t>Programação Orientada a Objetos | UNIVASF</w:t>
       </w:r>
     </w:p>
     <w:p>
@@ -1014,22 +1086,7 @@
         <w:rPr>
           <w:w w:val="105"/>
         </w:rPr>
-        <w:t xml:space="preserve">Versão simplificada do meu jogo Eixo 0, escrita para praticar orientação a objetos: </w:t>
-      </w:r>
-      <w:r>
-        <w:rPr>
-          <w:b/>
-          <w:bCs/>
-          <w:w w:val="105"/>
-          <w:u w:val="single"/>
-        </w:rPr>
-        <w:t>27 classes</w:t>
-      </w:r>
-      <w:r>
-        <w:rPr>
-          <w:w w:val="105"/>
-        </w:rPr>
-        <w:t xml:space="preserve"> organizadas em pacotes de mundo e personagens.</w:t>
+        <w:t>Metroidvania 2D em Java 17 com FXGL, feito em grupo com Raioni Felix e Hiago Lima: salas conectadas, três tipos de inimigo, ataque corpo a corpo e dash.</w:t>
       </w:r>
     </w:p>
     <w:p>
@@ -1051,7 +1108,22 @@
         <w:rPr>
           <w:w w:val="105"/>
         </w:rPr>
-        <w:t>Classes abstratas e interfaces para personagens, inimigos (corpo a corpo, voador e de longo alcance), armas e habilidades com custo de energia e tempo de recarga.</w:t>
+        <w:t xml:space="preserve">Fiz o jogador e sua física, a gravidade, a colisão e o knockback dos inimigos, os projéteis, o menu e as fases carregadas de </w:t>
+      </w:r>
+      <w:r>
+        <w:rPr>
+          <w:b/>
+          <w:bCs/>
+          <w:w w:val="105"/>
+          <w:u w:val="single"/>
+        </w:rPr>
+        <w:t>arquivos JSON</w:t>
+      </w:r>
+      <w:r>
+        <w:rPr>
+          <w:w w:val="105"/>
+        </w:rPr>
+        <w:t xml:space="preserve"> com Gson.</w:t>
       </w:r>
     </w:p>
     <w:p>
@@ -1073,7 +1145,7 @@
         <w:rPr>
           <w:w w:val="105"/>
         </w:rPr>
-        <w:t>Inventário, sistema de nível e experiência, e mapa de salas indexado por id com LinkedHashMap.</w:t>
+        <w:t>Na versão barebones, o jogo foi reescrito em 28 classes Java puras, com classes abstratas, interfaces e polimorfismo.</w:t>
       </w:r>
     </w:p>
     <w:p>

</xml_diff>